<commit_message>
feat: trying to copy an example from metodychka
</commit_message>
<xml_diff>
--- a/51IP Injenerija prykladnyh zastosunkiv/2/IP_KNT-116m_Onyshchenko_15_PR2.docx
+++ b/51IP Injenerija prykladnyh zastosunkiv/2/IP_KNT-116m_Onyshchenko_15_PR2.docx
@@ -1976,37 +1976,11 @@
         </w:rPr>
         <w:t>це наскільки вихід моделі відрізняється від правильного значення.</w:t>
       </w:r>
-    </w:p>
-    <w:p>
-      <w:pPr>
-        <w:pStyle w:val="p11"/>
-        <w:rPr>
-          <w:lang w:val="en-US"/>
-        </w:rPr>
-      </w:pPr>
-      <w:r>
-        <w:rPr>
-          <w:lang w:val="uk-UA"/>
-        </w:rPr>
-        <w:t xml:space="preserve">Що таке </w:t>
-      </w:r>
-      <w:r>
-        <w:rPr>
-          <w:lang w:val="en-US"/>
-        </w:rPr>
-        <w:t>ROC к</w:t>
-      </w:r>
-      <w:r>
-        <w:rPr>
-          <w:lang w:val="uk-UA"/>
-        </w:rPr>
-        <w:t>рива</w:t>
-      </w:r>
-      <w:r>
-        <w:rPr>
-          <w:lang w:val="en-US"/>
-        </w:rPr>
-        <w:t xml:space="preserve">? </w:t>
+      <w:r>
+        <w:rPr>
+          <w:lang w:val="en-US"/>
+        </w:rPr>
+        <w:t xml:space="preserve"> </w:t>
       </w:r>
     </w:p>
     <w:p>
@@ -2186,6 +2160,34 @@
       <w:r>
         <w:rPr/>
         <w:t>Поясніть поняття «Комп’ютерне бачення».</w:t>
+      </w:r>
+    </w:p>
+    <w:p>
+      <w:pPr>
+        <w:pStyle w:val="P1"/>
+        <w:rPr/>
+      </w:pPr>
+      <w:r>
+        <w:rPr/>
+      </w:r>
+    </w:p>
+    <w:p>
+      <w:pPr>
+        <w:pStyle w:val="P1"/>
+        <w:rPr/>
+      </w:pPr>
+      <w:r>
+        <w:rPr/>
+        <w:t xml:space="preserve">Комп’ютерне бачення це здатність комп’ютера обробляти (завантажувати, опрацьовувати, модифікувати) зображення з реального світу. </w:t>
+      </w:r>
+    </w:p>
+    <w:p>
+      <w:pPr>
+        <w:pStyle w:val="P1"/>
+        <w:rPr/>
+      </w:pPr>
+      <w:r>
+        <w:rPr/>
       </w:r>
     </w:p>
     <w:p>
@@ -2312,6 +2314,37 @@
       <w:r>
         <w:rPr/>
         <w:t>У чому полягає суть розпізнавання зображень?</w:t>
+      </w:r>
+    </w:p>
+    <w:p>
+      <w:pPr>
+        <w:pStyle w:val="P1"/>
+        <w:rPr/>
+      </w:pPr>
+      <w:r>
+        <w:rPr/>
+      </w:r>
+    </w:p>
+    <w:p>
+      <w:pPr>
+        <w:pStyle w:val="P1"/>
+        <w:rPr/>
+      </w:pPr>
+      <w:r>
+        <w:rPr/>
+        <w:t xml:space="preserve">Кожне зображення представляється як сітка пікселів, кожен з яких має або 3 значення — </w:t>
+      </w:r>
+      <w:r>
+        <w:rPr>
+          <w:lang w:val="en-US"/>
+        </w:rPr>
+        <w:t xml:space="preserve">Red, Green, Blue – </w:t>
+      </w:r>
+      <w:r>
+        <w:rPr>
+          <w:lang w:val="uk-UA"/>
+        </w:rPr>
+        <w:t>або значення сірого від 0 до 255.</w:t>
       </w:r>
     </w:p>
     <w:sectPr>

</xml_diff>

<commit_message>
feat: ai generated the app
</commit_message>
<xml_diff>
--- a/51IP Injenerija prykladnyh zastosunkiv/2/IP_KNT-116m_Onyshchenko_15_PR2.docx
+++ b/51IP Injenerija prykladnyh zastosunkiv/2/IP_KNT-116m_Onyshchenko_15_PR2.docx
@@ -2082,6 +2082,34 @@
       <w:r>
         <w:rPr/>
         <w:t>Вхідні дані</w:t>
+      </w:r>
+    </w:p>
+    <w:p>
+      <w:pPr>
+        <w:pStyle w:val="p11"/>
+        <w:rPr/>
+      </w:pPr>
+      <w:r>
+        <w:rPr/>
+      </w:r>
+    </w:p>
+    <w:p>
+      <w:pPr>
+        <w:pStyle w:val="p11"/>
+        <w:rPr/>
+      </w:pPr>
+      <w:r>
+        <w:rPr/>
+        <w:t>Фрагмент вхідних даних та їх опис.</w:t>
+      </w:r>
+    </w:p>
+    <w:p>
+      <w:pPr>
+        <w:pStyle w:val="p11"/>
+        <w:rPr/>
+      </w:pPr>
+      <w:r>
+        <w:rPr/>
       </w:r>
     </w:p>
     <w:p>
@@ -3145,8 +3173,8 @@
       <w:lang w:val="en-US" w:eastAsia="uk-UA"/>
     </w:rPr>
   </w:style>
-  <w:style w:type="character" w:styleId="Style12">
-    <w:name w:val="Символ нумерації"/>
+  <w:style w:type="character" w:styleId="user">
+    <w:name w:val="Символ нумерації (user)"/>
     <w:qFormat/>
     <w:rPr/>
   </w:style>
@@ -3157,7 +3185,7 @@
       <w:u w:val="single"/>
     </w:rPr>
   </w:style>
-  <w:style w:type="paragraph" w:styleId="Style13">
+  <w:style w:type="paragraph" w:styleId="Style12">
     <w:name w:val="Заголовок"/>
     <w:basedOn w:val="Normal"/>
     <w:next w:val="BodyText"/>
@@ -3167,7 +3195,7 @@
       <w:spacing w:before="240" w:after="120"/>
     </w:pPr>
     <w:rPr>
-      <w:rFonts w:ascii="Liberation Sans" w:hAnsi="Liberation Sans" w:eastAsia="Microsoft YaHei" w:cs="Lucida Sans"/>
+      <w:rFonts w:ascii="Liberation Sans" w:hAnsi="Liberation Sans" w:eastAsia="Microsoft YaHei" w:cs="Arial Unicode MS"/>
       <w:sz w:val="28"/>
       <w:szCs w:val="28"/>
     </w:rPr>
@@ -3204,7 +3232,7 @@
       <w:szCs w:val="24"/>
     </w:rPr>
   </w:style>
-  <w:style w:type="paragraph" w:styleId="Style14">
+  <w:style w:type="paragraph" w:styleId="Style13">
     <w:name w:val="Покажчик"/>
     <w:basedOn w:val="Normal"/>
     <w:qFormat/>
@@ -3212,10 +3240,10 @@
       <w:suppressLineNumbers/>
     </w:pPr>
     <w:rPr>
-      <w:rFonts w:cs="Lucida Sans"/>
-    </w:rPr>
-  </w:style>
-  <w:style w:type="paragraph" w:styleId="user">
+      <w:rFonts w:cs="Arial Unicode MS"/>
+    </w:rPr>
+  </w:style>
+  <w:style w:type="paragraph" w:styleId="user1">
     <w:name w:val="Заголовок (user)"/>
     <w:basedOn w:val="Normal"/>
     <w:next w:val="BodyText"/>
@@ -3225,12 +3253,12 @@
       <w:spacing w:before="240" w:after="120"/>
     </w:pPr>
     <w:rPr>
-      <w:rFonts w:ascii="Liberation Sans" w:hAnsi="Liberation Sans" w:eastAsia="Microsoft YaHei" w:cs="Arial Unicode MS"/>
+      <w:rFonts w:ascii="Liberation Sans" w:hAnsi="Liberation Sans" w:eastAsia="Microsoft YaHei" w:cs="Lucida Sans"/>
       <w:sz w:val="28"/>
       <w:szCs w:val="28"/>
     </w:rPr>
   </w:style>
-  <w:style w:type="paragraph" w:styleId="user1">
+  <w:style w:type="paragraph" w:styleId="user2">
     <w:name w:val="Покажчик (user)"/>
     <w:basedOn w:val="Normal"/>
     <w:qFormat/>
@@ -3238,12 +3266,12 @@
       <w:suppressLineNumbers/>
     </w:pPr>
     <w:rPr>
-      <w:rFonts w:cs="Arial Unicode MS"/>
+      <w:rFonts w:cs="Lucida Sans"/>
     </w:rPr>
   </w:style>
   <w:style w:type="paragraph" w:styleId="IndexHeading">
     <w:name w:val="index heading"/>
-    <w:basedOn w:val="user"/>
+    <w:basedOn w:val="Style12"/>
     <w:pPr/>
     <w:rPr/>
   </w:style>
@@ -3519,8 +3547,8 @@
     </w:pPr>
     <w:rPr/>
   </w:style>
-  <w:style w:type="paragraph" w:styleId="Style15">
-    <w:name w:val="Верхній і нижній колонтитули"/>
+  <w:style w:type="paragraph" w:styleId="user3">
+    <w:name w:val="Верхній і нижній колонтитули (user)"/>
     <w:basedOn w:val="Normal"/>
     <w:qFormat/>
     <w:pPr>
@@ -3533,8 +3561,8 @@
     </w:pPr>
     <w:rPr/>
   </w:style>
-  <w:style w:type="paragraph" w:styleId="user2">
-    <w:name w:val="Верхній і нижній колонтитули (user)"/>
+  <w:style w:type="paragraph" w:styleId="Style14">
+    <w:name w:val="Верхній і нижній колонтитули"/>
     <w:basedOn w:val="Normal"/>
     <w:qFormat/>
     <w:pPr/>
@@ -3542,14 +3570,14 @@
   </w:style>
   <w:style w:type="paragraph" w:styleId="Header">
     <w:name w:val="header"/>
-    <w:basedOn w:val="Style15"/>
+    <w:basedOn w:val="user3"/>
     <w:pPr>
       <w:suppressLineNumbers/>
     </w:pPr>
     <w:rPr/>
   </w:style>
-  <w:style w:type="paragraph" w:styleId="user3">
-    <w:name w:val="Горизонтальна лінія (user)"/>
+  <w:style w:type="paragraph" w:styleId="Style15">
+    <w:name w:val="Горизонтальна лінія"/>
     <w:basedOn w:val="Normal"/>
     <w:next w:val="BodyText"/>
     <w:qFormat/>
@@ -3565,8 +3593,8 @@
       <w:szCs w:val="12"/>
     </w:rPr>
   </w:style>
-  <w:style w:type="numbering" w:styleId="user4" w:default="1">
-    <w:name w:val="Без маркерів (user)"/>
+  <w:style w:type="numbering" w:styleId="Style16" w:default="1">
+    <w:name w:val="Без маркерів"/>
     <w:uiPriority w:val="99"/>
     <w:semiHidden/>
     <w:unhideWhenUsed/>

</xml_diff>